<commit_message>
B563: „expune la răspundere penală” instead of „scoate în afara legii penale”
The old phrase reads as decriminalisation to a lawyer, the opposite of what the
analysis meant (art. 25 of Law 51/1995 makes it a crime). Fixed in the five
passages and the memo, with a correction note on the page.
</commit_message>
<xml_diff>
--- a/public/docs/Punct_de_vedere_B563-2026.docx
+++ b/public/docs/Punct_de_vedere_B563-2026.docx
@@ -128,7 +128,7 @@
           <w:sz w:val="22"/>
           <w:szCs w:val="22"/>
         </w:rPr>
-        <w:t xml:space="preserve">În realitate, modificarea Art. 3 alin. (2) din Legea 51/1995 (eliminarea sintagmei „dacă legea nu prevede altfel” și restrângerea excepțiilor exclusiv la „alte profesii juridice”) coroborată cu Art. 1241–1245 Cod Civil și noile litere de la Art. 3 alin. (1) scoate în afara legii penale (Art. 25) experții contabili (CECCAR), specialiștii HR, mediatorii și platformele digitale, fără niciun test de proporționalitate conform Directivei (UE) 2018/958.</w:t>
+        <w:t xml:space="preserve">În realitate, modificarea Art. 3 alin. (2) din Legea 51/1995 (eliminarea sintagmei „dacă legea nu prevede altfel” și restrângerea excepțiilor exclusiv la „alte profesii juridice”) coroborată cu Art. 1241–1245 Cod Civil și noile litere de la Art. 3 alin. (1) expune la răspundere penală (Art. 25) experții contabili (CECCAR), specialiștii HR, mediatorii și platformele digitale care fac aceste acte, fără niciun test de proporționalitate conform Directivei (UE) 2018/958.</w:t>
       </w:r>
     </w:p>
     <w:p>
@@ -202,7 +202,7 @@
           <w:sz w:val="22"/>
           <w:szCs w:val="22"/>
         </w:rPr>
-        <w:t xml:space="preserve">Prin Art. I pct. 8 din proiect, la art. 3 alin. (2) din Legea nr. 51/1995 se elimină sintagma „dacă legea nu prevede altfel” și se înlocuiește cu „cu excepția celor care sunt stabilite în mod expres prin lege și în competența altor profesii juridice”. Coroborat cu noile litere k^1–k^6 de la art. 3 alin. (1) și cu modificarea art. 1241 alin. (2), art. 1243 alin. (2) și art. 1245 alin. (2) din Codul Civil, proiectul scoate în afara legii penale (prin raportare la art. 25 din Legea nr. 51/1995) activități desfășurate în mod legal de profesii economice reglementate, precum experții contabili și contabilii autorizați (OG nr. 65/1994), consultanții fiscali (OG nr. 71/2001) și specialiștii în resurse umane.</w:t>
+        <w:t xml:space="preserve">Prin Art. I pct. 8 din proiect, la art. 3 alin. (2) din Legea nr. 51/1995 se elimină sintagma „dacă legea nu prevede altfel” și se înlocuiește cu „cu excepția celor care sunt stabilite în mod expres prin lege și în competența altor profesii juridice”. Coroborat cu noile litere k^1–k^6 de la art. 3 alin. (1) și cu modificarea art. 1241 alin. (2), art. 1243 alin. (2) și art. 1245 alin. (2) din Codul Civil, proiectul incriminează, prin raportare la art. 25 din Legea nr. 51/1995, activități desfășurate în prezent în mod legal de profesii economice reglementate, precum experții contabili și contabilii autorizați (OG nr. 65/1994), consultanții fiscali (OG nr. 71/2001) și specialiștii în resurse umane.</w:t>
       </w:r>
     </w:p>
     <w:p>
@@ -461,7 +461,7 @@
           <w:sz w:val="18"/>
           <w:szCs w:val="18"/>
         </w:rPr>
-        <w:t xml:space="preserve">Generat prin platforma civică „La Straja Legii” • Referință proiect: B563/2026 (Cod Senat 27999)</w:t>
+        <w:t xml:space="preserve">Generat prin platforma civică destrajă.ro • Referință proiect: B563/2026 (Cod Senat 27999)</w:t>
       </w:r>
     </w:p>
     <w:sectPr>

</xml_diff>